<commit_message>
Feedback: Feedback van Noëmi ontvangen en beschreven
</commit_message>
<xml_diff>
--- a/Documentatie/4. programmeren en onderzoek/feedback.docx
+++ b/Documentatie/4. programmeren en onderzoek/feedback.docx
@@ -3,6 +3,9 @@
 <w:document xmlns:wpc="http://schemas.microsoft.com/office/word/2010/wordprocessingCanvas" xmlns:cx="http://schemas.microsoft.com/office/drawing/2014/chartex" xmlns:cx1="http://schemas.microsoft.com/office/drawing/2015/9/8/chartex" xmlns:cx2="http://schemas.microsoft.com/office/drawing/2015/10/21/chartex" xmlns:cx3="http://schemas.microsoft.com/office/drawing/2016/5/9/chartex" xmlns:cx4="http://schemas.microsoft.com/office/drawing/2016/5/10/chartex" xmlns:cx5="http://schemas.microsoft.com/office/drawing/2016/5/11/chartex" xmlns:cx6="http://schemas.microsoft.com/office/drawing/2016/5/12/chartex" xmlns:cx7="http://schemas.microsoft.com/office/drawing/2016/5/13/chartex" xmlns:cx8="http://schemas.microsoft.com/office/drawing/2016/5/14/chartex" xmlns:mc="http://schemas.openxmlformats.org/markup-compatibility/2006" xmlns:aink="http://schemas.microsoft.com/office/drawing/2016/ink" xmlns:am3d="http://schemas.microsoft.com/office/drawing/2017/model3d" xmlns:o="urn:schemas-microsoft-com:office:office" xmlns:oel="http://schemas.microsoft.com/office/2019/extlst" xmlns:r="http://schemas.openxmlformats.org/officeDocument/2006/relationships" xmlns:m="http://schemas.openxmlformats.org/officeDocument/2006/math" xmlns:v="urn:schemas-microsoft-com:vml" xmlns:wp14="http://schemas.microsoft.com/office/word/2010/wordprocessingDrawing" xmlns:wp="http://schemas.openxmlformats.org/drawingml/2006/wordprocessingDrawing" xmlns:w10="urn:schemas-microsoft-com:office:word" xmlns:w="http://schemas.openxmlformats.org/wordprocessingml/2006/main" xmlns:w14="http://schemas.microsoft.com/office/word/2010/wordml" xmlns:w15="http://schemas.microsoft.com/office/word/2012/wordml" xmlns:w16cex="http://schemas.microsoft.com/office/word/2018/wordml/cex" xmlns:w16cid="http://schemas.microsoft.com/office/word/2016/wordml/cid" xmlns:w16="http://schemas.microsoft.com/office/word/2018/wordml" xmlns:w16du="http://schemas.microsoft.com/office/word/2023/wordml/word16du" xmlns:w16sdtdh="http://schemas.microsoft.com/office/word/2020/wordml/sdtdatahash" xmlns:w16sdtfl="http://schemas.microsoft.com/office/word/2024/wordml/sdtformatlock" xmlns:w16se="http://schemas.microsoft.com/office/word/2015/wordml/symex" xmlns:wpg="http://schemas.microsoft.com/office/word/2010/wordprocessingGroup" xmlns:wpi="http://schemas.microsoft.com/office/word/2010/wordprocessingInk" xmlns:wne="http://schemas.microsoft.com/office/word/2006/wordml" xmlns:wps="http://schemas.microsoft.com/office/word/2010/wordprocessingShape" mc:Ignorable="w14 w15 w16se w16cid w16 w16cex w16sdtdh w16sdtfl w16du wp14">
   <w:body>
     <w:p>
+      <w:pPr>
+        <w:pStyle w:val="Kop1"/>
+      </w:pPr>
       <w:r>
         <w:t>01-04-2026</w:t>
       </w:r>
@@ -38,6 +41,117 @@
     <w:p>
       <w:r>
         <w:t>Ik heb een document aangemaakt waarin ik beschrijf wat elk gedeelte van de code doet, en waarom ik voor deze optie heb gekozen.</w:t>
+      </w:r>
+    </w:p>
+    <w:p>
+      <w:pPr>
+        <w:pStyle w:val="Kop1"/>
+      </w:pPr>
+      <w:r>
+        <w:t>15-04-2026</w:t>
+      </w:r>
+    </w:p>
+    <w:p>
+      <w:r>
+        <w:t>Ik ben naar Noëmi gegaan en heb de volgende vraag gesteld:</w:t>
+      </w:r>
+    </w:p>
+    <w:p>
+      <w:pPr>
+        <w:pStyle w:val="Lijstalinea"/>
+        <w:numPr>
+          <w:ilvl w:val="0"/>
+          <w:numId w:val="1"/>
+        </w:numPr>
+      </w:pPr>
+      <w:r>
+        <w:t>Kan ik met het ontwikkelproces document duidelijk aantonen dat de code van mij is en dat ik in leer proces aantoon</w:t>
+      </w:r>
+      <w:r>
+        <w:t>?</w:t>
+      </w:r>
+    </w:p>
+    <w:p>
+      <w:pPr>
+        <w:pStyle w:val="Lijstalinea"/>
+        <w:numPr>
+          <w:ilvl w:val="0"/>
+          <w:numId w:val="1"/>
+        </w:numPr>
+      </w:pPr>
+      <w:r>
+        <w:t xml:space="preserve">Kan ik met de documenten API GET en API POST aantonen dat ik </w:t>
+      </w:r>
+      <w:r>
+        <w:t>REST API</w:t>
+      </w:r>
+      <w:r>
+        <w:t>’</w:t>
+      </w:r>
+      <w:r>
+        <w:t>s begrijp</w:t>
+      </w:r>
+    </w:p>
+    <w:p>
+      <w:pPr>
+        <w:pStyle w:val="Lijstalinea"/>
+        <w:numPr>
+          <w:ilvl w:val="0"/>
+          <w:numId w:val="1"/>
+        </w:numPr>
+      </w:pPr>
+      <w:r>
+        <w:t>Kan ik CSV en JSON gebruiken op de manier hoe ik het op dit moment gebruik en daarmee ook kan aantonen dat ik dataformat kan toepassen?</w:t>
+      </w:r>
+    </w:p>
+    <w:p>
+      <w:r>
+        <w:t>Noëmi heeft de volgende feedback gegeven:</w:t>
+      </w:r>
+    </w:p>
+    <w:p>
+      <w:pPr>
+        <w:pStyle w:val="Lijstalinea"/>
+        <w:numPr>
+          <w:ilvl w:val="0"/>
+          <w:numId w:val="1"/>
+        </w:numPr>
+      </w:pPr>
+      <w:r>
+        <w:t xml:space="preserve">Door dit document laat je goed zien dat het jouw code is en dat je een leer proces hebt gehad. Specifiek over </w:t>
+      </w:r>
+      <w:r>
+        <w:t>het gedeelte van de CSV export.</w:t>
+      </w:r>
+    </w:p>
+    <w:p>
+      <w:pPr>
+        <w:pStyle w:val="Lijstalinea"/>
+        <w:numPr>
+          <w:ilvl w:val="0"/>
+          <w:numId w:val="1"/>
+        </w:numPr>
+      </w:pPr>
+      <w:r>
+        <w:t xml:space="preserve">Meeste studenten </w:t>
+      </w:r>
+      <w:r>
+        <w:t>gebruiken de steam API en weather API. Maar als jij je eigen API’s wilt maken en dat je het duidelijk kan uitleggen dat je het begrijpt is dat zeker aantoonbaar. En in je documentatie is ook te zien dat je het begrijpt en dat je er een leerproces mee hebt gehad.</w:t>
+      </w:r>
+    </w:p>
+    <w:p>
+      <w:pPr>
+        <w:pStyle w:val="Lijstalinea"/>
+        <w:numPr>
+          <w:ilvl w:val="0"/>
+          <w:numId w:val="1"/>
+        </w:numPr>
+      </w:pPr>
+      <w:r>
+        <w:t xml:space="preserve">Het is prima hoe je CSV en JSON gebruikt in je code en je kan hier </w:t>
+      </w:r>
+      <w:r>
+        <w:t>mee aantonen dat je dataformat kan toepassen binnen een code.</w:t>
       </w:r>
     </w:p>
     <w:sectPr>
@@ -48,6 +162,127 @@
     </w:sectPr>
   </w:body>
 </w:document>
+</file>
+
+<file path=word/numbering.xml><?xml version="1.0" encoding="utf-8"?>
+<w:numbering xmlns:wpc="http://schemas.microsoft.com/office/word/2010/wordprocessingCanvas" xmlns:cx="http://schemas.microsoft.com/office/drawing/2014/chartex" xmlns:cx1="http://schemas.microsoft.com/office/drawing/2015/9/8/chartex" xmlns:cx2="http://schemas.microsoft.com/office/drawing/2015/10/21/chartex" xmlns:cx3="http://schemas.microsoft.com/office/drawing/2016/5/9/chartex" xmlns:cx4="http://schemas.microsoft.com/office/drawing/2016/5/10/chartex" xmlns:cx5="http://schemas.microsoft.com/office/drawing/2016/5/11/chartex" xmlns:cx6="http://schemas.microsoft.com/office/drawing/2016/5/12/chartex" xmlns:cx7="http://schemas.microsoft.com/office/drawing/2016/5/13/chartex" xmlns:cx8="http://schemas.microsoft.com/office/drawing/2016/5/14/chartex" xmlns:mc="http://schemas.openxmlformats.org/markup-compatibility/2006" xmlns:aink="http://schemas.microsoft.com/office/drawing/2016/ink" xmlns:am3d="http://schemas.microsoft.com/office/drawing/2017/model3d" xmlns:o="urn:schemas-microsoft-com:office:office" xmlns:oel="http://schemas.microsoft.com/office/2019/extlst" xmlns:r="http://schemas.openxmlformats.org/officeDocument/2006/relationships" xmlns:m="http://schemas.openxmlformats.org/officeDocument/2006/math" xmlns:v="urn:schemas-microsoft-com:vml" xmlns:wp14="http://schemas.microsoft.com/office/word/2010/wordprocessingDrawing" xmlns:wp="http://schemas.openxmlformats.org/drawingml/2006/wordprocessingDrawing" xmlns:w10="urn:schemas-microsoft-com:office:word" xmlns:w="http://schemas.openxmlformats.org/wordprocessingml/2006/main" xmlns:w14="http://schemas.microsoft.com/office/word/2010/wordml" xmlns:w15="http://schemas.microsoft.com/office/word/2012/wordml" xmlns:w16cex="http://schemas.microsoft.com/office/word/2018/wordml/cex" xmlns:w16cid="http://schemas.microsoft.com/office/word/2016/wordml/cid" xmlns:w16="http://schemas.microsoft.com/office/word/2018/wordml" xmlns:w16du="http://schemas.microsoft.com/office/word/2023/wordml/word16du" xmlns:w16sdtdh="http://schemas.microsoft.com/office/word/2020/wordml/sdtdatahash" xmlns:w16sdtfl="http://schemas.microsoft.com/office/word/2024/wordml/sdtformatlock" xmlns:w16se="http://schemas.microsoft.com/office/word/2015/wordml/symex" xmlns:wpg="http://schemas.microsoft.com/office/word/2010/wordprocessingGroup" xmlns:wpi="http://schemas.microsoft.com/office/word/2010/wordprocessingInk" xmlns:wne="http://schemas.microsoft.com/office/word/2006/wordml" xmlns:wps="http://schemas.microsoft.com/office/word/2010/wordprocessingShape" mc:Ignorable="w14 w15 w16se w16cid w16 w16cex w16sdtdh w16sdtfl w16du wp14">
+  <w:abstractNum w:abstractNumId="0" w15:restartNumberingAfterBreak="0">
+    <w:nsid w:val="64072160"/>
+    <w:multiLevelType w:val="hybridMultilevel"/>
+    <w:tmpl w:val="A8E62558"/>
+    <w:lvl w:ilvl="0" w:tplc="24DC69DC">
+      <w:start w:val="15"/>
+      <w:numFmt w:val="bullet"/>
+      <w:lvlText w:val="-"/>
+      <w:lvlJc w:val="left"/>
+      <w:pPr>
+        <w:ind w:left="720" w:hanging="360"/>
+      </w:pPr>
+      <w:rPr>
+        <w:rFonts w:ascii="Aptos" w:eastAsiaTheme="minorHAnsi" w:hAnsi="Aptos" w:cstheme="minorBidi" w:hint="default"/>
+      </w:rPr>
+    </w:lvl>
+    <w:lvl w:ilvl="1" w:tplc="20000003" w:tentative="1">
+      <w:start w:val="1"/>
+      <w:numFmt w:val="bullet"/>
+      <w:lvlText w:val="o"/>
+      <w:lvlJc w:val="left"/>
+      <w:pPr>
+        <w:ind w:left="1440" w:hanging="360"/>
+      </w:pPr>
+      <w:rPr>
+        <w:rFonts w:ascii="Courier New" w:hAnsi="Courier New" w:cs="Courier New" w:hint="default"/>
+      </w:rPr>
+    </w:lvl>
+    <w:lvl w:ilvl="2" w:tplc="20000005" w:tentative="1">
+      <w:start w:val="1"/>
+      <w:numFmt w:val="bullet"/>
+      <w:lvlText w:val=""/>
+      <w:lvlJc w:val="left"/>
+      <w:pPr>
+        <w:ind w:left="2160" w:hanging="360"/>
+      </w:pPr>
+      <w:rPr>
+        <w:rFonts w:ascii="Wingdings" w:hAnsi="Wingdings" w:hint="default"/>
+      </w:rPr>
+    </w:lvl>
+    <w:lvl w:ilvl="3" w:tplc="20000001" w:tentative="1">
+      <w:start w:val="1"/>
+      <w:numFmt w:val="bullet"/>
+      <w:lvlText w:val=""/>
+      <w:lvlJc w:val="left"/>
+      <w:pPr>
+        <w:ind w:left="2880" w:hanging="360"/>
+      </w:pPr>
+      <w:rPr>
+        <w:rFonts w:ascii="Symbol" w:hAnsi="Symbol" w:hint="default"/>
+      </w:rPr>
+    </w:lvl>
+    <w:lvl w:ilvl="4" w:tplc="20000003" w:tentative="1">
+      <w:start w:val="1"/>
+      <w:numFmt w:val="bullet"/>
+      <w:lvlText w:val="o"/>
+      <w:lvlJc w:val="left"/>
+      <w:pPr>
+        <w:ind w:left="3600" w:hanging="360"/>
+      </w:pPr>
+      <w:rPr>
+        <w:rFonts w:ascii="Courier New" w:hAnsi="Courier New" w:cs="Courier New" w:hint="default"/>
+      </w:rPr>
+    </w:lvl>
+    <w:lvl w:ilvl="5" w:tplc="20000005" w:tentative="1">
+      <w:start w:val="1"/>
+      <w:numFmt w:val="bullet"/>
+      <w:lvlText w:val=""/>
+      <w:lvlJc w:val="left"/>
+      <w:pPr>
+        <w:ind w:left="4320" w:hanging="360"/>
+      </w:pPr>
+      <w:rPr>
+        <w:rFonts w:ascii="Wingdings" w:hAnsi="Wingdings" w:hint="default"/>
+      </w:rPr>
+    </w:lvl>
+    <w:lvl w:ilvl="6" w:tplc="20000001" w:tentative="1">
+      <w:start w:val="1"/>
+      <w:numFmt w:val="bullet"/>
+      <w:lvlText w:val=""/>
+      <w:lvlJc w:val="left"/>
+      <w:pPr>
+        <w:ind w:left="5040" w:hanging="360"/>
+      </w:pPr>
+      <w:rPr>
+        <w:rFonts w:ascii="Symbol" w:hAnsi="Symbol" w:hint="default"/>
+      </w:rPr>
+    </w:lvl>
+    <w:lvl w:ilvl="7" w:tplc="20000003" w:tentative="1">
+      <w:start w:val="1"/>
+      <w:numFmt w:val="bullet"/>
+      <w:lvlText w:val="o"/>
+      <w:lvlJc w:val="left"/>
+      <w:pPr>
+        <w:ind w:left="5760" w:hanging="360"/>
+      </w:pPr>
+      <w:rPr>
+        <w:rFonts w:ascii="Courier New" w:hAnsi="Courier New" w:cs="Courier New" w:hint="default"/>
+      </w:rPr>
+    </w:lvl>
+    <w:lvl w:ilvl="8" w:tplc="20000005" w:tentative="1">
+      <w:start w:val="1"/>
+      <w:numFmt w:val="bullet"/>
+      <w:lvlText w:val=""/>
+      <w:lvlJc w:val="left"/>
+      <w:pPr>
+        <w:ind w:left="6480" w:hanging="360"/>
+      </w:pPr>
+      <w:rPr>
+        <w:rFonts w:ascii="Wingdings" w:hAnsi="Wingdings" w:hint="default"/>
+      </w:rPr>
+    </w:lvl>
+  </w:abstractNum>
+  <w:num w:numId="1" w16cid:durableId="1342122697">
+    <w:abstractNumId w:val="0"/>
+  </w:num>
+</w:numbering>
 </file>
 
 <file path=word/styles.xml><?xml version="1.0" encoding="utf-8"?>

</xml_diff>